<commit_message>
Finalize experiment-focused thesis structure and deliver Word final version
Agent-Logs-Url: https://github.com/lawliet103110-art/dpft/sessions/b412ad23-2858-4724-8bfe-03215895a458

Co-authored-by: lawliet103110-art <247488912+lawliet103110-art@users.noreply.github.com>
</commit_message>
<xml_diff>
--- a/毕业论文最终版.docx
+++ b/毕业论文最终版.docx
@@ -204,18 +204,27 @@
     </w:p>
     <w:p/>
     <w:p>
-      <w:r>
-        <w:t>1. **工程价值**：在不重写整套检测框架的前提下提升学生模型可部署性；</w:t>
-      </w:r>
-    </w:p>
-    <w:p>
-      <w:r>
-        <w:t>2. **研究价值**：探索输出层蒸馏在查询式三维检测中的有效监督形式；</w:t>
-      </w:r>
-    </w:p>
-    <w:p>
-      <w:r>
-        <w:t>3. **实践价值**：形成可复现的配置、训练、消融与对比流程，便于毕业论文实证化表达。</w:t>
+      <w:pPr>
+        <w:pStyle w:val="ListNumber"/>
+      </w:pPr>
+      <w:r>
+        <w:t>**工程价值**：在不重写整套检测框架的前提下提升学生模型可部署性；</w:t>
+      </w:r>
+    </w:p>
+    <w:p>
+      <w:pPr>
+        <w:pStyle w:val="ListNumber"/>
+      </w:pPr>
+      <w:r>
+        <w:t>**研究价值**：探索输出层蒸馏在查询式三维检测中的有效监督形式；</w:t>
+      </w:r>
+    </w:p>
+    <w:p>
+      <w:pPr>
+        <w:pStyle w:val="ListNumber"/>
+      </w:pPr>
+      <w:r>
+        <w:t>**实践价值**：形成可复现的配置、训练、消融与对比流程，便于毕业论文实证化表达。</w:t>
       </w:r>
     </w:p>
     <w:p/>
@@ -277,38 +286,59 @@
     </w:p>
     <w:p/>
     <w:p>
-      <w:r>
-        <w:t>1. 教师模型结构分析与蒸馏接口梳理；</w:t>
-      </w:r>
-    </w:p>
-    <w:p>
-      <w:r>
-        <w:t>2. DistillationLoss与KDLoss的实现与联调；</w:t>
-      </w:r>
-    </w:p>
-    <w:p>
-      <w:r>
-        <w:t>3. 基于匈牙利匹配的matched蒸馏策略实现；</w:t>
-      </w:r>
-    </w:p>
-    <w:p>
-      <w:r>
-        <w:t>4. 学生模型轻量级/中等压缩配置设计；</w:t>
-      </w:r>
-    </w:p>
-    <w:p>
-      <w:r>
-        <w:t>5. 低显存重压缩配置效果分析与排除说明；</w:t>
-      </w:r>
-    </w:p>
-    <w:p>
-      <w:r>
-        <w:t>6. 参数敏感性实验方案设计（T、α、k）；</w:t>
-      </w:r>
-    </w:p>
-    <w:p>
-      <w:r>
-        <w:t>7. 子集快速验证与全量实验规划。</w:t>
+      <w:pPr>
+        <w:pStyle w:val="ListNumber"/>
+      </w:pPr>
+      <w:r>
+        <w:t>教师模型结构分析与蒸馏接口梳理；</w:t>
+      </w:r>
+    </w:p>
+    <w:p>
+      <w:pPr>
+        <w:pStyle w:val="ListNumber"/>
+      </w:pPr>
+      <w:r>
+        <w:t>DistillationLoss与KDLoss的实现与联调；</w:t>
+      </w:r>
+    </w:p>
+    <w:p>
+      <w:pPr>
+        <w:pStyle w:val="ListNumber"/>
+      </w:pPr>
+      <w:r>
+        <w:t>基于匈牙利匹配的matched蒸馏策略实现；</w:t>
+      </w:r>
+    </w:p>
+    <w:p>
+      <w:pPr>
+        <w:pStyle w:val="ListNumber"/>
+      </w:pPr>
+      <w:r>
+        <w:t>学生模型轻量级/中等压缩配置设计；</w:t>
+      </w:r>
+    </w:p>
+    <w:p>
+      <w:pPr>
+        <w:pStyle w:val="ListNumber"/>
+      </w:pPr>
+      <w:r>
+        <w:t>低显存重压缩配置效果分析与排除说明；</w:t>
+      </w:r>
+    </w:p>
+    <w:p>
+      <w:pPr>
+        <w:pStyle w:val="ListNumber"/>
+      </w:pPr>
+      <w:r>
+        <w:t>参数敏感性实验方案设计（T、α、k）；</w:t>
+      </w:r>
+    </w:p>
+    <w:p>
+      <w:pPr>
+        <w:pStyle w:val="ListNumber"/>
+      </w:pPr>
+      <w:r>
+        <w:t>子集快速验证与全量实验规划。</w:t>
       </w:r>
     </w:p>
     <w:p/>
@@ -453,18 +483,27 @@
     </w:p>
     <w:p/>
     <w:p>
-      <w:r>
-        <w:t>1. 分类蒸馏（软标签、KL散度）；</w:t>
-      </w:r>
-    </w:p>
-    <w:p>
-      <w:r>
-        <w:t>2. 回归蒸馏（L1/L2等几何约束）；</w:t>
-      </w:r>
-    </w:p>
-    <w:p>
-      <w:r>
-        <w:t>3. 特征蒸馏（中间层特征对齐）。</w:t>
+      <w:pPr>
+        <w:pStyle w:val="ListNumber"/>
+      </w:pPr>
+      <w:r>
+        <w:t>分类蒸馏（软标签、KL散度）；</w:t>
+      </w:r>
+    </w:p>
+    <w:p>
+      <w:pPr>
+        <w:pStyle w:val="ListNumber"/>
+      </w:pPr>
+      <w:r>
+        <w:t>回归蒸馏（L1/L2等几何约束）；</w:t>
+      </w:r>
+    </w:p>
+    <w:p>
+      <w:pPr>
+        <w:pStyle w:val="ListNumber"/>
+      </w:pPr>
+      <w:r>
+        <w:t>特征蒸馏（中间层特征对齐）。</w:t>
       </w:r>
     </w:p>
     <w:p/>
@@ -535,23 +574,35 @@
     </w:p>
     <w:p/>
     <w:p>
-      <w:r>
-        <w:t>1. 输出层蒸馏能否有效提升轻量学生模型性能？</w:t>
-      </w:r>
-    </w:p>
-    <w:p>
-      <w:r>
-        <w:t>2. 如何利用匹配机制让蒸馏聚焦有效查询而非背景噪声？</w:t>
-      </w:r>
-    </w:p>
-    <w:p>
-      <w:r>
-        <w:t>3. 温度T、权重α及top-k参数k对蒸馏效果有何影响？</w:t>
-      </w:r>
-    </w:p>
-    <w:p>
-      <w:r>
-        <w:t>4. 学生模型压缩程度与检测性能之间如何折中？</w:t>
+      <w:pPr>
+        <w:pStyle w:val="ListNumber"/>
+      </w:pPr>
+      <w:r>
+        <w:t>输出层蒸馏能否有效提升轻量学生模型性能？</w:t>
+      </w:r>
+    </w:p>
+    <w:p>
+      <w:pPr>
+        <w:pStyle w:val="ListNumber"/>
+      </w:pPr>
+      <w:r>
+        <w:t>如何利用匹配机制让蒸馏聚焦有效查询而非背景噪声？</w:t>
+      </w:r>
+    </w:p>
+    <w:p>
+      <w:pPr>
+        <w:pStyle w:val="ListNumber"/>
+      </w:pPr>
+      <w:r>
+        <w:t>温度T、权重α及top-k参数k对蒸馏效果有何影响？</w:t>
+      </w:r>
+    </w:p>
+    <w:p>
+      <w:pPr>
+        <w:pStyle w:val="ListNumber"/>
+      </w:pPr>
+      <w:r>
+        <w:t>学生模型压缩程度与检测性能之间如何折中？</w:t>
       </w:r>
     </w:p>
     <w:p/>
@@ -571,28 +622,43 @@
     </w:p>
     <w:p/>
     <w:p>
-      <w:r>
-        <w:t>1. 构建统一蒸馏损失接口；</w:t>
-      </w:r>
-    </w:p>
-    <w:p>
-      <w:r>
-        <w:t>2. 支持分类+回归联合蒸馏；</w:t>
-      </w:r>
-    </w:p>
-    <w:p>
-      <w:r>
-        <w:t>3. 支持匹配索引驱动的蒸馏模式；</w:t>
-      </w:r>
-    </w:p>
-    <w:p>
-      <w:r>
-        <w:t>4. 与原检测损失端到端联合训练；</w:t>
-      </w:r>
-    </w:p>
-    <w:p>
-      <w:r>
-        <w:t>5. 形成可比较的学生模型配置。</w:t>
+      <w:pPr>
+        <w:pStyle w:val="ListNumber"/>
+      </w:pPr>
+      <w:r>
+        <w:t>构建统一蒸馏损失接口；</w:t>
+      </w:r>
+    </w:p>
+    <w:p>
+      <w:pPr>
+        <w:pStyle w:val="ListNumber"/>
+      </w:pPr>
+      <w:r>
+        <w:t>支持分类+回归联合蒸馏；</w:t>
+      </w:r>
+    </w:p>
+    <w:p>
+      <w:pPr>
+        <w:pStyle w:val="ListNumber"/>
+      </w:pPr>
+      <w:r>
+        <w:t>支持匹配索引驱动的蒸馏模式；</w:t>
+      </w:r>
+    </w:p>
+    <w:p>
+      <w:pPr>
+        <w:pStyle w:val="ListNumber"/>
+      </w:pPr>
+      <w:r>
+        <w:t>与原检测损失端到端联合训练；</w:t>
+      </w:r>
+    </w:p>
+    <w:p>
+      <w:pPr>
+        <w:pStyle w:val="ListNumber"/>
+      </w:pPr>
+      <w:r>
+        <w:t>形成可比较的学生模型配置。</w:t>
       </w:r>
     </w:p>
     <w:p/>
@@ -612,28 +678,43 @@
     </w:p>
     <w:p/>
     <w:p>
-      <w:r>
-        <w:t>1. 解析教师模型输出结构及匹配流程；</w:t>
-      </w:r>
-    </w:p>
-    <w:p>
-      <w:r>
-        <w:t>2. 在训练损失层引入DistillationLoss；</w:t>
-      </w:r>
-    </w:p>
-    <w:p>
-      <w:r>
-        <w:t>3. 在总损失层引入KDLoss并与原损失融合；</w:t>
-      </w:r>
-    </w:p>
-    <w:p>
-      <w:r>
-        <w:t>4. 构建light/medium/low_memory学生配置并对比；</w:t>
-      </w:r>
-    </w:p>
-    <w:p>
-      <w:r>
-        <w:t>5. 进行参数敏感性实验与分阶段验证。</w:t>
+      <w:pPr>
+        <w:pStyle w:val="ListNumber"/>
+      </w:pPr>
+      <w:r>
+        <w:t>解析教师模型输出结构及匹配流程；</w:t>
+      </w:r>
+    </w:p>
+    <w:p>
+      <w:pPr>
+        <w:pStyle w:val="ListNumber"/>
+      </w:pPr>
+      <w:r>
+        <w:t>在训练损失层引入DistillationLoss；</w:t>
+      </w:r>
+    </w:p>
+    <w:p>
+      <w:pPr>
+        <w:pStyle w:val="ListNumber"/>
+      </w:pPr>
+      <w:r>
+        <w:t>在总损失层引入KDLoss并与原损失融合；</w:t>
+      </w:r>
+    </w:p>
+    <w:p>
+      <w:pPr>
+        <w:pStyle w:val="ListNumber"/>
+      </w:pPr>
+      <w:r>
+        <w:t>构建light/medium/low_memory学生配置并对比；</w:t>
+      </w:r>
+    </w:p>
+    <w:p>
+      <w:pPr>
+        <w:pStyle w:val="ListNumber"/>
+      </w:pPr>
+      <w:r>
+        <w:t>进行参数敏感性实验与分阶段验证。</w:t>
       </w:r>
     </w:p>
     <w:p/>
@@ -683,18 +764,27 @@
     </w:p>
     <w:p/>
     <w:p>
-      <w:r>
-        <w:t>1. 查询式检测输出形式；</w:t>
-      </w:r>
-    </w:p>
-    <w:p>
-      <w:r>
-        <w:t>2. IMPFusion跨模态融合在输出层的影响；</w:t>
-      </w:r>
-    </w:p>
-    <w:p>
-      <w:r>
-        <w:t>3. 匈牙利匹配在监督构建中的作用。</w:t>
+      <w:pPr>
+        <w:pStyle w:val="ListNumber"/>
+      </w:pPr>
+      <w:r>
+        <w:t>查询式检测输出形式；</w:t>
+      </w:r>
+    </w:p>
+    <w:p>
+      <w:pPr>
+        <w:pStyle w:val="ListNumber"/>
+      </w:pPr>
+      <w:r>
+        <w:t>IMPFusion跨模态融合在输出层的影响；</w:t>
+      </w:r>
+    </w:p>
+    <w:p>
+      <w:pPr>
+        <w:pStyle w:val="ListNumber"/>
+      </w:pPr>
+      <w:r>
+        <w:t>匈牙利匹配在监督构建中的作用。</w:t>
       </w:r>
     </w:p>
     <w:p/>
@@ -799,13 +889,19 @@
     </w:p>
     <w:p/>
     <w:p>
-      <w:r>
-        <w:t>1. **DistillationLoss**：计算蒸馏项；</w:t>
-      </w:r>
-    </w:p>
-    <w:p>
-      <w:r>
-        <w:t>2. **KDLoss**：融合任务损失与蒸馏损失。</w:t>
+      <w:pPr>
+        <w:pStyle w:val="ListNumber"/>
+      </w:pPr>
+      <w:r>
+        <w:t>**DistillationLoss**：计算蒸馏项；</w:t>
+      </w:r>
+    </w:p>
+    <w:p>
+      <w:pPr>
+        <w:pStyle w:val="ListNumber"/>
+      </w:pPr>
+      <w:r>
+        <w:t>**KDLoss**：融合任务损失与蒸馏损失。</w:t>
       </w:r>
     </w:p>
     <w:p/>
@@ -846,23 +942,35 @@
     </w:p>
     <w:p/>
     <w:p>
-      <w:r>
-        <w:t>1. 分类蒸馏：基于教师与学生logits计算KL散度；</w:t>
-      </w:r>
-    </w:p>
-    <w:p>
-      <w:r>
-        <w:t>2. 回归蒸馏：对中心、尺寸、朝向等框参数计算L1损失；</w:t>
-      </w:r>
-    </w:p>
-    <w:p>
-      <w:r>
-        <w:t>3. 温度参数T：控制软标签分布平滑程度；</w:t>
-      </w:r>
-    </w:p>
-    <w:p>
-      <w:r>
-        <w:t>4. 可配置开关：可选择仅蒸馏分类或联合蒸馏。</w:t>
+      <w:pPr>
+        <w:pStyle w:val="ListNumber"/>
+      </w:pPr>
+      <w:r>
+        <w:t>分类蒸馏：基于教师与学生logits计算KL散度；</w:t>
+      </w:r>
+    </w:p>
+    <w:p>
+      <w:pPr>
+        <w:pStyle w:val="ListNumber"/>
+      </w:pPr>
+      <w:r>
+        <w:t>回归蒸馏：对中心、尺寸、朝向等框参数计算L1损失；</w:t>
+      </w:r>
+    </w:p>
+    <w:p>
+      <w:pPr>
+        <w:pStyle w:val="ListNumber"/>
+      </w:pPr>
+      <w:r>
+        <w:t>温度参数T：控制软标签分布平滑程度；</w:t>
+      </w:r>
+    </w:p>
+    <w:p>
+      <w:pPr>
+        <w:pStyle w:val="ListNumber"/>
+      </w:pPr>
+      <w:r>
+        <w:t>可配置开关：可选择仅蒸馏分类或联合蒸馏。</w:t>
       </w:r>
     </w:p>
     <w:p/>
@@ -882,23 +990,35 @@
     </w:p>
     <w:p/>
     <w:p>
-      <w:r>
-        <w:t>1. 保留原检测任务目标；</w:t>
-      </w:r>
-    </w:p>
-    <w:p>
-      <w:r>
-        <w:t>2. 引入蒸馏监督项；</w:t>
-      </w:r>
-    </w:p>
-    <w:p>
-      <w:r>
-        <w:t>3. 使用权重α平衡两者；</w:t>
-      </w:r>
-    </w:p>
-    <w:p>
-      <w:r>
-        <w:t>4. 在训练日志中分项输出，便于调参与诊断。</w:t>
+      <w:pPr>
+        <w:pStyle w:val="ListNumber"/>
+      </w:pPr>
+      <w:r>
+        <w:t>保留原检测任务目标；</w:t>
+      </w:r>
+    </w:p>
+    <w:p>
+      <w:pPr>
+        <w:pStyle w:val="ListNumber"/>
+      </w:pPr>
+      <w:r>
+        <w:t>引入蒸馏监督项；</w:t>
+      </w:r>
+    </w:p>
+    <w:p>
+      <w:pPr>
+        <w:pStyle w:val="ListNumber"/>
+      </w:pPr>
+      <w:r>
+        <w:t>使用权重α平衡两者；</w:t>
+      </w:r>
+    </w:p>
+    <w:p>
+      <w:pPr>
+        <w:pStyle w:val="ListNumber"/>
+      </w:pPr>
+      <w:r>
+        <w:t>在训练日志中分项输出，便于调参与诊断。</w:t>
       </w:r>
     </w:p>
     <w:p/>
@@ -927,8 +1047,11 @@
     </w:p>
     <w:p/>
     <w:p>
-      <w:r>
-        <w:t>1. **matched distillation**：</w:t>
+      <w:pPr>
+        <w:pStyle w:val="ListNumber"/>
+      </w:pPr>
+      <w:r>
+        <w:t>**matched distillation**：</w:t>
       </w:r>
     </w:p>
     <w:p>
@@ -943,8 +1066,11 @@
     </w:p>
     <w:p/>
     <w:p>
-      <w:r>
-        <w:t>2. **all distillation**：</w:t>
+      <w:pPr>
+        <w:pStyle w:val="ListNumber"/>
+      </w:pPr>
+      <w:r>
+        <w:t>**all distillation**：</w:t>
       </w:r>
     </w:p>
     <w:p>
@@ -968,8 +1094,11 @@
     </w:p>
     <w:p/>
     <w:p>
-      <w:r>
-        <w:t>1. **top_k distillation（扩展）**：</w:t>
+      <w:pPr>
+        <w:pStyle w:val="ListNumber"/>
+      </w:pPr>
+      <w:r>
+        <w:t>**top_k distillation（扩展）**：</w:t>
       </w:r>
     </w:p>
     <w:p>
@@ -984,8 +1113,11 @@
     </w:p>
     <w:p/>
     <w:p>
-      <w:r>
-        <w:t>2. **weighted distillation（扩展）**：</w:t>
+      <w:pPr>
+        <w:pStyle w:val="ListNumber"/>
+      </w:pPr>
+      <w:r>
+        <w:t>**weighted distillation（扩展）**：</w:t>
       </w:r>
     </w:p>
     <w:p>
@@ -1021,28 +1153,43 @@
     </w:p>
     <w:p/>
     <w:p>
-      <w:r>
-        <w:t>1. 前向得到教师与学生输出；</w:t>
-      </w:r>
-    </w:p>
-    <w:p>
-      <w:r>
-        <w:t>2. 计算学生检测损失；</w:t>
-      </w:r>
-    </w:p>
-    <w:p>
-      <w:r>
-        <w:t>3. 根据蒸馏模式构建蒸馏索引与蒸馏目标；</w:t>
-      </w:r>
-    </w:p>
-    <w:p>
-      <w:r>
-        <w:t>4. 计算蒸馏损失并与检测损失加权融合；</w:t>
-      </w:r>
-    </w:p>
-    <w:p>
-      <w:r>
-        <w:t>5. 反向传播更新学生参数。</w:t>
+      <w:pPr>
+        <w:pStyle w:val="ListNumber"/>
+      </w:pPr>
+      <w:r>
+        <w:t>前向得到教师与学生输出；</w:t>
+      </w:r>
+    </w:p>
+    <w:p>
+      <w:pPr>
+        <w:pStyle w:val="ListNumber"/>
+      </w:pPr>
+      <w:r>
+        <w:t>计算学生检测损失；</w:t>
+      </w:r>
+    </w:p>
+    <w:p>
+      <w:pPr>
+        <w:pStyle w:val="ListNumber"/>
+      </w:pPr>
+      <w:r>
+        <w:t>根据蒸馏模式构建蒸馏索引与蒸馏目标；</w:t>
+      </w:r>
+    </w:p>
+    <w:p>
+      <w:pPr>
+        <w:pStyle w:val="ListNumber"/>
+      </w:pPr>
+      <w:r>
+        <w:t>计算蒸馏损失并与检测损失加权融合；</w:t>
+      </w:r>
+    </w:p>
+    <w:p>
+      <w:pPr>
+        <w:pStyle w:val="ListNumber"/>
+      </w:pPr>
+      <w:r>
+        <w:t>反向传播更新学生参数。</w:t>
       </w:r>
     </w:p>
     <w:p/>
@@ -1092,18 +1239,27 @@
     </w:p>
     <w:p/>
     <w:p>
-      <w:r>
-        <w:t>1. 保证训练稳定性优先；</w:t>
-      </w:r>
-    </w:p>
-    <w:p>
-      <w:r>
-        <w:t>2. 避免一次性重压缩导致结论失真；</w:t>
-      </w:r>
-    </w:p>
-    <w:p>
-      <w:r>
-        <w:t>3. 通过对比明确压缩与性能关系。</w:t>
+      <w:pPr>
+        <w:pStyle w:val="ListNumber"/>
+      </w:pPr>
+      <w:r>
+        <w:t>保证训练稳定性优先；</w:t>
+      </w:r>
+    </w:p>
+    <w:p>
+      <w:pPr>
+        <w:pStyle w:val="ListNumber"/>
+      </w:pPr>
+      <w:r>
+        <w:t>避免一次性重压缩导致结论失真；</w:t>
+      </w:r>
+    </w:p>
+    <w:p>
+      <w:pPr>
+        <w:pStyle w:val="ListNumber"/>
+      </w:pPr>
+      <w:r>
+        <w:t>通过对比明确压缩与性能关系。</w:t>
       </w:r>
     </w:p>
     <w:p/>
@@ -1269,23 +1425,35 @@
     </w:p>
     <w:p/>
     <w:p>
-      <w:r>
-        <w:t>1. 先在light配置验证蒸馏可行性；</w:t>
-      </w:r>
-    </w:p>
-    <w:p>
-      <w:r>
-        <w:t>2. 再迁移到medium配置做主对比；</w:t>
-      </w:r>
-    </w:p>
-    <w:p>
-      <w:r>
-        <w:t>3. 对OOM等问题通过batch size、混合精度等策略处理；</w:t>
-      </w:r>
-    </w:p>
-    <w:p>
-      <w:r>
-        <w:t>4. 通过损失分项日志判断蒸馏是否有效。</w:t>
+      <w:pPr>
+        <w:pStyle w:val="ListNumber"/>
+      </w:pPr>
+      <w:r>
+        <w:t>先在light配置验证蒸馏可行性；</w:t>
+      </w:r>
+    </w:p>
+    <w:p>
+      <w:pPr>
+        <w:pStyle w:val="ListNumber"/>
+      </w:pPr>
+      <w:r>
+        <w:t>再迁移到medium配置做主对比；</w:t>
+      </w:r>
+    </w:p>
+    <w:p>
+      <w:pPr>
+        <w:pStyle w:val="ListNumber"/>
+      </w:pPr>
+      <w:r>
+        <w:t>对OOM等问题通过batch size、混合精度等策略处理；</w:t>
+      </w:r>
+    </w:p>
+    <w:p>
+      <w:pPr>
+        <w:pStyle w:val="ListNumber"/>
+      </w:pPr>
+      <w:r>
+        <w:t>通过损失分项日志判断蒸馏是否有效。</w:t>
       </w:r>
     </w:p>
     <w:p/>
@@ -1320,23 +1488,35 @@
     </w:p>
     <w:p/>
     <w:p>
-      <w:r>
-        <w:t>1. 验证蒸馏能否提升学生模型性能；</w:t>
-      </w:r>
-    </w:p>
-    <w:p>
-      <w:r>
-        <w:t>2. 比较matched与all模式差异；</w:t>
-      </w:r>
-    </w:p>
-    <w:p>
-      <w:r>
-        <w:t>3. 分析不同压缩级别下的精度与效率变化；</w:t>
-      </w:r>
-    </w:p>
-    <w:p>
-      <w:r>
-        <w:t>4. 评估参数T、α的敏感性，并将k参数作为top_k扩展模式的后续敏感性验证项。</w:t>
+      <w:pPr>
+        <w:pStyle w:val="ListNumber"/>
+      </w:pPr>
+      <w:r>
+        <w:t>验证蒸馏能否提升学生模型性能；</w:t>
+      </w:r>
+    </w:p>
+    <w:p>
+      <w:pPr>
+        <w:pStyle w:val="ListNumber"/>
+      </w:pPr>
+      <w:r>
+        <w:t>比较matched与all模式差异；</w:t>
+      </w:r>
+    </w:p>
+    <w:p>
+      <w:pPr>
+        <w:pStyle w:val="ListNumber"/>
+      </w:pPr>
+      <w:r>
+        <w:t>分析不同压缩级别下的精度与效率变化；</w:t>
+      </w:r>
+    </w:p>
+    <w:p>
+      <w:pPr>
+        <w:pStyle w:val="ListNumber"/>
+      </w:pPr>
+      <w:r>
+        <w:t>评估参数T、α的敏感性，并将k参数作为top_k扩展模式的后续敏感性验证项。</w:t>
       </w:r>
     </w:p>
     <w:p/>
@@ -1356,23 +1536,35 @@
     </w:p>
     <w:p/>
     <w:p>
-      <w:r>
-        <w:t>1. 检测精度：mAP等；</w:t>
-      </w:r>
-    </w:p>
-    <w:p>
-      <w:r>
-        <w:t>2. 推理效率：FPS/时延；</w:t>
-      </w:r>
-    </w:p>
-    <w:p>
-      <w:r>
-        <w:t>3. 资源代价：参数量、显存占用；</w:t>
-      </w:r>
-    </w:p>
-    <w:p>
-      <w:r>
-        <w:t>4. 训练行为：loss曲线稳定性。</w:t>
+      <w:pPr>
+        <w:pStyle w:val="ListNumber"/>
+      </w:pPr>
+      <w:r>
+        <w:t>检测精度：mAP等；</w:t>
+      </w:r>
+    </w:p>
+    <w:p>
+      <w:pPr>
+        <w:pStyle w:val="ListNumber"/>
+      </w:pPr>
+      <w:r>
+        <w:t>推理效率：FPS/时延；</w:t>
+      </w:r>
+    </w:p>
+    <w:p>
+      <w:pPr>
+        <w:pStyle w:val="ListNumber"/>
+      </w:pPr>
+      <w:r>
+        <w:t>资源代价：参数量、显存占用；</w:t>
+      </w:r>
+    </w:p>
+    <w:p>
+      <w:pPr>
+        <w:pStyle w:val="ListNumber"/>
+      </w:pPr>
+      <w:r>
+        <w:t>训练行为：loss曲线稳定性。</w:t>
       </w:r>
     </w:p>
     <w:p/>
@@ -1392,18 +1584,27 @@
     </w:p>
     <w:p/>
     <w:p>
-      <w:r>
-        <w:t>1. 已完成：温度T（2.0、4.0、6.0、8.0）；</w:t>
-      </w:r>
-    </w:p>
-    <w:p>
-      <w:r>
-        <w:t>2. 已完成：蒸馏权重α（0.3、0.5、0.7、0.9）；</w:t>
-      </w:r>
-    </w:p>
-    <w:p>
-      <w:r>
-        <w:t>3. 扩展规划：top_k参数k（10、25、50、100、200）。</w:t>
+      <w:pPr>
+        <w:pStyle w:val="ListNumber"/>
+      </w:pPr>
+      <w:r>
+        <w:t>已完成：温度T（2.0、4.0、6.0、8.0）；</w:t>
+      </w:r>
+    </w:p>
+    <w:p>
+      <w:pPr>
+        <w:pStyle w:val="ListNumber"/>
+      </w:pPr>
+      <w:r>
+        <w:t>已完成：蒸馏权重α（0.3、0.5、0.7、0.9）；</w:t>
+      </w:r>
+    </w:p>
+    <w:p>
+      <w:pPr>
+        <w:pStyle w:val="ListNumber"/>
+      </w:pPr>
+      <w:r>
+        <w:t>扩展规划：top_k参数k（10、25、50、100、200）。</w:t>
       </w:r>
     </w:p>
     <w:p/>
@@ -1429,8 +1630,11 @@
     </w:p>
     <w:p/>
     <w:p>
-      <w:r>
-        <w:t>1. **子集快速验证**：</w:t>
+      <w:pPr>
+        <w:pStyle w:val="ListNumber"/>
+      </w:pPr>
+      <w:r>
+        <w:t>**子集快速验证**：</w:t>
       </w:r>
     </w:p>
     <w:p>
@@ -1445,8 +1649,11 @@
     </w:p>
     <w:p/>
     <w:p>
-      <w:r>
-        <w:t>2. **全量最终验证**：</w:t>
+      <w:pPr>
+        <w:pStyle w:val="ListNumber"/>
+      </w:pPr>
+      <w:r>
+        <w:t>**全量最终验证**：</w:t>
       </w:r>
     </w:p>
     <w:p>
@@ -1476,28 +1683,43 @@
     </w:p>
     <w:p/>
     <w:p>
-      <w:r>
-        <w:t>1. baseline vs KD-light；</w:t>
-      </w:r>
-    </w:p>
-    <w:p>
-      <w:r>
-        <w:t>2. KD-light vs KD-medium；</w:t>
-      </w:r>
-    </w:p>
-    <w:p>
-      <w:r>
-        <w:t>3. matched vs all；</w:t>
-      </w:r>
-    </w:p>
-    <w:p>
-      <w:r>
-        <w:t>4. T/α消融曲线（已完成）与k消融曲线（扩展项）；</w:t>
-      </w:r>
-    </w:p>
-    <w:p>
-      <w:r>
-        <w:t>5. 失败配置（low_memory）排除理由。</w:t>
+      <w:pPr>
+        <w:pStyle w:val="ListNumber"/>
+      </w:pPr>
+      <w:r>
+        <w:t>baseline vs KD-light；</w:t>
+      </w:r>
+    </w:p>
+    <w:p>
+      <w:pPr>
+        <w:pStyle w:val="ListNumber"/>
+      </w:pPr>
+      <w:r>
+        <w:t>KD-light vs KD-medium；</w:t>
+      </w:r>
+    </w:p>
+    <w:p>
+      <w:pPr>
+        <w:pStyle w:val="ListNumber"/>
+      </w:pPr>
+      <w:r>
+        <w:t>matched vs all；</w:t>
+      </w:r>
+    </w:p>
+    <w:p>
+      <w:pPr>
+        <w:pStyle w:val="ListNumber"/>
+      </w:pPr>
+      <w:r>
+        <w:t>T/α消融曲线（已完成）与k消融曲线（扩展项）；</w:t>
+      </w:r>
+    </w:p>
+    <w:p>
+      <w:pPr>
+        <w:pStyle w:val="ListNumber"/>
+      </w:pPr>
+      <w:r>
+        <w:t>失败配置（low_memory）排除理由。</w:t>
       </w:r>
     </w:p>
     <w:p/>
@@ -1541,22 +1763,391 @@
     </w:p>
     <w:p/>
     <w:p>
-      <w:r>
-        <w:t>1. matched模式通常更聚焦有效监督，适合查询式检测蒸馏；</w:t>
-      </w:r>
-    </w:p>
-    <w:p>
-      <w:r>
-        <w:t>2. 压缩并非越大越好，过压缩会导致可蒸馏知识容量不足；</w:t>
-      </w:r>
-    </w:p>
-    <w:p>
-      <w:r>
-        <w:t>3. 参数敏感性分析对本科论文非常关键，可直接体现“算法研究”深度。</w:t>
+      <w:pPr>
+        <w:pStyle w:val="ListNumber"/>
+      </w:pPr>
+      <w:r>
+        <w:t>matched模式通常更聚焦有效监督，适合查询式检测蒸馏；</w:t>
+      </w:r>
+    </w:p>
+    <w:p>
+      <w:pPr>
+        <w:pStyle w:val="ListNumber"/>
+      </w:pPr>
+      <w:r>
+        <w:t>压缩并非越大越好，过压缩会导致可蒸馏知识容量不足；</w:t>
+      </w:r>
+    </w:p>
+    <w:p>
+      <w:pPr>
+        <w:pStyle w:val="ListNumber"/>
+      </w:pPr>
+      <w:r>
+        <w:t>参数敏感性分析对本科论文非常关键，可直接体现“算法研究”深度。</w:t>
       </w:r>
     </w:p>
     <w:p/>
     <w:p>
+      <w:pPr>
+        <w:pStyle w:val="Heading3"/>
+      </w:pPr>
+      <w:r>
+        <w:t>7.7 实验环境与复现设置</w:t>
+      </w:r>
+    </w:p>
+    <w:p/>
+    <w:p>
+      <w:r>
+        <w:t>为保证实验结论可复现，本文统一约束以下实验条件：</w:t>
+      </w:r>
+    </w:p>
+    <w:p/>
+    <w:p>
+      <w:pPr>
+        <w:pStyle w:val="ListNumber"/>
+      </w:pPr>
+      <w:r>
+        <w:t>使用同一数据划分策略，避免训练/验证集切分变化带来的指标波动；</w:t>
+      </w:r>
+    </w:p>
+    <w:p>
+      <w:pPr>
+        <w:pStyle w:val="ListNumber"/>
+      </w:pPr>
+      <w:r>
+        <w:t>教师与学生模型共享一致的数据预处理流程，仅在模型配置与蒸馏参数上做对照；</w:t>
+      </w:r>
+    </w:p>
+    <w:p>
+      <w:pPr>
+        <w:pStyle w:val="ListNumber"/>
+      </w:pPr>
+      <w:r>
+        <w:t>每轮实验均固定随机种子并记录训练日志、checkpoint与评估输出；</w:t>
+      </w:r>
+    </w:p>
+    <w:p>
+      <w:pPr>
+        <w:pStyle w:val="ListNumber"/>
+      </w:pPr>
+      <w:r>
+        <w:t>对比实验采用“单变量变更”原则，禁止同时改变多个关键超参数。</w:t>
+      </w:r>
+    </w:p>
+    <w:p/>
+    <w:p>
+      <w:r>
+        <w:t>在论文终稿中，实验环境应明确给出硬件平台、CUDA/Python版本、关键依赖库版本以及训练耗时统计。该部分不是工程实现细节堆砌，而是保证实验可信度与可验证性的必要学术信息。</w:t>
+      </w:r>
+    </w:p>
+    <w:p/>
+    <w:p>
+      <w:pPr>
+        <w:pStyle w:val="Heading3"/>
+      </w:pPr>
+      <w:r>
+        <w:t>7.8 Baseline与学生模型对比实验</w:t>
+      </w:r>
+    </w:p>
+    <w:p/>
+    <w:p>
+      <w:r>
+        <w:t>本节实验目标是回答“蒸馏是否能在压缩后保持有效性能”。对比对象建议包括：</w:t>
+      </w:r>
+    </w:p>
+    <w:p/>
+    <w:p>
+      <w:pPr>
+        <w:pStyle w:val="ListBullet"/>
+      </w:pPr>
+      <w:r>
+        <w:t>教师模型（Teacher-DPFT）；</w:t>
+      </w:r>
+    </w:p>
+    <w:p>
+      <w:pPr>
+        <w:pStyle w:val="ListBullet"/>
+      </w:pPr>
+      <w:r>
+        <w:t>未蒸馏学生模型（Student-NoKD）；</w:t>
+      </w:r>
+    </w:p>
+    <w:p>
+      <w:pPr>
+        <w:pStyle w:val="ListBullet"/>
+      </w:pPr>
+      <w:r>
+        <w:t>蒸馏学生模型（KD-light、KD-medium）。</w:t>
+      </w:r>
+    </w:p>
+    <w:p/>
+    <w:p>
+      <w:r>
+        <w:t>分析时应围绕三类指标展开：</w:t>
+      </w:r>
+    </w:p>
+    <w:p/>
+    <w:p>
+      <w:pPr>
+        <w:pStyle w:val="ListNumber"/>
+      </w:pPr>
+      <w:r>
+        <w:t>准确性指标（mAP及其分项）；</w:t>
+      </w:r>
+    </w:p>
+    <w:p>
+      <w:pPr>
+        <w:pStyle w:val="ListNumber"/>
+      </w:pPr>
+      <w:r>
+        <w:t>效率指标（推理速度/时延）；</w:t>
+      </w:r>
+    </w:p>
+    <w:p>
+      <w:pPr>
+        <w:pStyle w:val="ListNumber"/>
+      </w:pPr>
+      <w:r>
+        <w:t>模型规模指标（参数量与显存占用）。</w:t>
+      </w:r>
+    </w:p>
+    <w:p/>
+    <w:p>
+      <w:r>
+        <w:t>结果阐述应强调“收益-代价”关系：若某配置在轻微精度损失下显著提升速度或降低参数量，则可判定其具备部署价值；若精度下降不可接受，即使速度提升明显也不能作为主方案。</w:t>
+      </w:r>
+    </w:p>
+    <w:p/>
+    <w:p>
+      <w:pPr>
+        <w:pStyle w:val="Heading3"/>
+      </w:pPr>
+      <w:r>
+        <w:t>7.9 蒸馏模式对比实验</w:t>
+      </w:r>
+    </w:p>
+    <w:p/>
+    <w:p>
+      <w:r>
+        <w:t>蒸馏模式对比重点放在matched与all：</w:t>
+      </w:r>
+    </w:p>
+    <w:p/>
+    <w:p>
+      <w:pPr>
+        <w:pStyle w:val="ListNumber"/>
+      </w:pPr>
+      <w:r>
+        <w:t>all模式覆盖全部查询，监督范围大但易受背景查询干扰；</w:t>
+      </w:r>
+    </w:p>
+    <w:p>
+      <w:pPr>
+        <w:pStyle w:val="ListNumber"/>
+      </w:pPr>
+      <w:r>
+        <w:t>matched模式只对匹配查询蒸馏，监督更集中，通常训练更稳定。</w:t>
+      </w:r>
+    </w:p>
+    <w:p/>
+    <w:p>
+      <w:r>
+        <w:t>对比实验建议在相同学生配置、相同T与α下执行，并从以下角度分析：</w:t>
+      </w:r>
+    </w:p>
+    <w:p/>
+    <w:p>
+      <w:pPr>
+        <w:pStyle w:val="ListBullet"/>
+      </w:pPr>
+      <w:r>
+        <w:t>总体mAP差异；</w:t>
+      </w:r>
+    </w:p>
+    <w:p>
+      <w:pPr>
+        <w:pStyle w:val="ListBullet"/>
+      </w:pPr>
+      <w:r>
+        <w:t>训练曲线收敛速度与波动幅度；</w:t>
+      </w:r>
+    </w:p>
+    <w:p>
+      <w:pPr>
+        <w:pStyle w:val="ListBullet"/>
+      </w:pPr>
+      <w:r>
+        <w:t>不同距离区间目标（近距/中距/远距）的表现变化。</w:t>
+      </w:r>
+    </w:p>
+    <w:p/>
+    <w:p>
+      <w:r>
+        <w:t>若matched在多数场景优于all，可将其作为论文主体结论；all则作为对照基线保留，以证明匹配驱动蒸馏的必要性。</w:t>
+      </w:r>
+    </w:p>
+    <w:p/>
+    <w:p>
+      <w:pPr>
+        <w:pStyle w:val="Heading3"/>
+      </w:pPr>
+      <w:r>
+        <w:t>7.10 参数敏感性实验与最优组合选择</w:t>
+      </w:r>
+    </w:p>
+    <w:p/>
+    <w:p>
+      <w:r>
+        <w:t>本文参数搜索包含温度T与权重α两条主线，top_k的k作为扩展线：</w:t>
+      </w:r>
+    </w:p>
+    <w:p/>
+    <w:p>
+      <w:pPr>
+        <w:pStyle w:val="ListNumber"/>
+      </w:pPr>
+      <w:r>
+        <w:t>温度T控制软标签平滑程度，过低可能导致监督过硬，过高会降低类别区分性；</w:t>
+      </w:r>
+    </w:p>
+    <w:p>
+      <w:pPr>
+        <w:pStyle w:val="ListNumber"/>
+      </w:pPr>
+      <w:r>
+        <w:t>权重α控制任务损失与蒸馏损失平衡，过小蒸馏作用不足，过大可能削弱检测主任务学习；</w:t>
+      </w:r>
+    </w:p>
+    <w:p>
+      <w:pPr>
+        <w:pStyle w:val="ListNumber"/>
+      </w:pPr>
+      <w:r>
+        <w:t>k参数用于扩展top_k策略，关注高置信查询迁移效率。</w:t>
+      </w:r>
+    </w:p>
+    <w:p/>
+    <w:p>
+      <w:r>
+        <w:t>最优参数选择原则为：优先满足验证集mAP提升，其次考虑训练稳定性，再综合推理效率。论文中应给出“参数—指标—结论”三列逻辑，避免只报最优值而不解释趋势。</w:t>
+      </w:r>
+    </w:p>
+    <w:p/>
+    <w:p>
+      <w:pPr>
+        <w:pStyle w:val="Heading3"/>
+      </w:pPr>
+      <w:r>
+        <w:t>7.11 low_memory重压缩配置排除分析</w:t>
+      </w:r>
+    </w:p>
+    <w:p/>
+    <w:p>
+      <w:r>
+        <w:t>针对nq由400降到100的low_memory方案，本文将其定义为“重压缩探索配置”。在实验观察中，该配置虽能降低资源占用，但检测性能下降明显，且不同蒸馏策略下均未恢复到可接受水平。</w:t>
+      </w:r>
+    </w:p>
+    <w:p/>
+    <w:p>
+      <w:r>
+        <w:t>排除逻辑应按以下步骤给出：</w:t>
+      </w:r>
+    </w:p>
+    <w:p/>
+    <w:p>
+      <w:pPr>
+        <w:pStyle w:val="ListNumber"/>
+      </w:pPr>
+      <w:r>
+        <w:t>与KD-medium在相同评估协议下进行直接对比；</w:t>
+      </w:r>
+    </w:p>
+    <w:p>
+      <w:pPr>
+        <w:pStyle w:val="ListNumber"/>
+      </w:pPr>
+      <w:r>
+        <w:t>报告关键指标下降幅度；</w:t>
+      </w:r>
+    </w:p>
+    <w:p>
+      <w:pPr>
+        <w:pStyle w:val="ListNumber"/>
+      </w:pPr>
+      <w:r>
+        <w:t>结合速度收益评估是否具备实际部署价值；</w:t>
+      </w:r>
+    </w:p>
+    <w:p>
+      <w:pPr>
+        <w:pStyle w:val="ListNumber"/>
+      </w:pPr>
+      <w:r>
+        <w:t>给出“保留为探索结果，不纳入主对比结论”的判定理由。</w:t>
+      </w:r>
+    </w:p>
+    <w:p/>
+    <w:p>
+      <w:r>
+        <w:t>该写法可以体现你对负结果的科学处理能力，也符合本科论文“结论可证、过程可追溯”的要求。</w:t>
+      </w:r>
+    </w:p>
+    <w:p/>
+    <w:p>
+      <w:pPr>
+        <w:pStyle w:val="Heading3"/>
+      </w:pPr>
+      <w:r>
+        <w:t>7.12 本章结论</w:t>
+      </w:r>
+    </w:p>
+    <w:p/>
+    <w:p>
+      <w:r>
+        <w:t>综合本章实验设计与结果分析，本文可形成以下结论框架：</w:t>
+      </w:r>
+    </w:p>
+    <w:p/>
+    <w:p>
+      <w:pPr>
+        <w:pStyle w:val="ListNumber"/>
+      </w:pPr>
+      <w:r>
+        <w:t>输出层知识蒸馏在轻中度压缩学生模型上具备有效性；</w:t>
+      </w:r>
+    </w:p>
+    <w:p>
+      <w:pPr>
+        <w:pStyle w:val="ListNumber"/>
+      </w:pPr>
+      <w:r>
+        <w:t>匹配驱动蒸馏（matched）是当前阶段更稳健的核心策略；</w:t>
+      </w:r>
+    </w:p>
+    <w:p>
+      <w:pPr>
+        <w:pStyle w:val="ListNumber"/>
+      </w:pPr>
+      <w:r>
+        <w:t>参数敏感性实验能够显著提升结论可信度，是本科算法论文的重要质量指标；</w:t>
+      </w:r>
+    </w:p>
+    <w:p>
+      <w:pPr>
+        <w:pStyle w:val="ListNumber"/>
+      </w:pPr>
+      <w:r>
+        <w:t>重压缩配置不应仅以速度收益评价，必须结合精度与稳定性做综合判断。</w:t>
+      </w:r>
+    </w:p>
+    <w:p/>
+    <w:p>
+      <w:r>
+        <w:t>以上结论为第八章总结提供直接证据链，也为后续扩展top_k/weighted实验奠定方法基础。</w:t>
+      </w:r>
+    </w:p>
+    <w:p/>
+    <w:p>
       <w:r>
         <w:t>---</w:t>
       </w:r>
@@ -1587,33 +2178,51 @@
     </w:p>
     <w:p/>
     <w:p>
-      <w:r>
-        <w:t>1. 教师模型蒸馏接口理解与任务拆解；</w:t>
-      </w:r>
-    </w:p>
-    <w:p>
-      <w:r>
-        <w:t>2. DistillationLoss与KDLoss实现；</w:t>
-      </w:r>
-    </w:p>
-    <w:p>
-      <w:r>
-        <w:t>3. matched/all蒸馏模式训练链路打通；</w:t>
-      </w:r>
-    </w:p>
-    <w:p>
-      <w:r>
-        <w:t>4. light/medium学生配置设计与对比；</w:t>
-      </w:r>
-    </w:p>
-    <w:p>
-      <w:r>
-        <w:t>5. low_memory重压缩方案排除分析；</w:t>
-      </w:r>
-    </w:p>
-    <w:p>
-      <w:r>
-        <w:t>6. 参数敏感性与分阶段实验方案构建。</w:t>
+      <w:pPr>
+        <w:pStyle w:val="ListNumber"/>
+      </w:pPr>
+      <w:r>
+        <w:t>教师模型蒸馏接口理解与任务拆解；</w:t>
+      </w:r>
+    </w:p>
+    <w:p>
+      <w:pPr>
+        <w:pStyle w:val="ListNumber"/>
+      </w:pPr>
+      <w:r>
+        <w:t>DistillationLoss与KDLoss实现；</w:t>
+      </w:r>
+    </w:p>
+    <w:p>
+      <w:pPr>
+        <w:pStyle w:val="ListNumber"/>
+      </w:pPr>
+      <w:r>
+        <w:t>matched/all蒸馏模式训练链路打通；</w:t>
+      </w:r>
+    </w:p>
+    <w:p>
+      <w:pPr>
+        <w:pStyle w:val="ListNumber"/>
+      </w:pPr>
+      <w:r>
+        <w:t>light/medium学生配置设计与对比；</w:t>
+      </w:r>
+    </w:p>
+    <w:p>
+      <w:pPr>
+        <w:pStyle w:val="ListNumber"/>
+      </w:pPr>
+      <w:r>
+        <w:t>low_memory重压缩方案排除分析；</w:t>
+      </w:r>
+    </w:p>
+    <w:p>
+      <w:pPr>
+        <w:pStyle w:val="ListNumber"/>
+      </w:pPr>
+      <w:r>
+        <w:t>参数敏感性与分阶段实验方案构建。</w:t>
       </w:r>
     </w:p>
     <w:p/>
@@ -1627,18 +2236,27 @@
     </w:p>
     <w:p/>
     <w:p>
-      <w:r>
-        <w:t>1. 研究定位清晰：聚焦算法蒸馏而非系统平台；</w:t>
-      </w:r>
-    </w:p>
-    <w:p>
-      <w:r>
-        <w:t>2. 工程闭环完整：配置、训练、对比、分析可复现；</w:t>
-      </w:r>
-    </w:p>
-    <w:p>
-      <w:r>
-        <w:t>3. 论文表达规范：以真实工作为依据，结构符合毕业论文写作逻辑。</w:t>
+      <w:pPr>
+        <w:pStyle w:val="ListNumber"/>
+      </w:pPr>
+      <w:r>
+        <w:t>研究定位清晰：聚焦算法蒸馏而非系统平台；</w:t>
+      </w:r>
+    </w:p>
+    <w:p>
+      <w:pPr>
+        <w:pStyle w:val="ListNumber"/>
+      </w:pPr>
+      <w:r>
+        <w:t>工程闭环完整：配置、训练、对比、分析可复现；</w:t>
+      </w:r>
+    </w:p>
+    <w:p>
+      <w:pPr>
+        <w:pStyle w:val="ListNumber"/>
+      </w:pPr>
+      <w:r>
+        <w:t>论文表达规范：以真实工作为依据，结构符合毕业论文写作逻辑。</w:t>
       </w:r>
     </w:p>
     <w:p/>
@@ -1652,23 +2270,35 @@
     </w:p>
     <w:p/>
     <w:p>
-      <w:r>
-        <w:t>1. 完整补齐top_k/weighted扩展实验结果；</w:t>
-      </w:r>
-    </w:p>
-    <w:p>
-      <w:r>
-        <w:t>2. 引入多随机种子重复实验，提升统计可靠性；</w:t>
-      </w:r>
-    </w:p>
-    <w:p>
-      <w:r>
-        <w:t>3. 增补可视化案例与误差分析图；</w:t>
-      </w:r>
-    </w:p>
-    <w:p>
-      <w:r>
-        <w:t>4. 按学校格式完善图表、公式与参考文献细节，形成40页以上终稿。</w:t>
+      <w:pPr>
+        <w:pStyle w:val="ListNumber"/>
+      </w:pPr>
+      <w:r>
+        <w:t>完整补齐top_k/weighted扩展实验结果；</w:t>
+      </w:r>
+    </w:p>
+    <w:p>
+      <w:pPr>
+        <w:pStyle w:val="ListNumber"/>
+      </w:pPr>
+      <w:r>
+        <w:t>引入多随机种子重复实验，提升统计可靠性；</w:t>
+      </w:r>
+    </w:p>
+    <w:p>
+      <w:pPr>
+        <w:pStyle w:val="ListNumber"/>
+      </w:pPr>
+      <w:r>
+        <w:t>增补可视化案例与误差分析图；</w:t>
+      </w:r>
+    </w:p>
+    <w:p>
+      <w:pPr>
+        <w:pStyle w:val="ListNumber"/>
+      </w:pPr>
+      <w:r>
+        <w:t>按学校格式完善图表、公式与参考文献细节，形成40页以上终稿。</w:t>
       </w:r>
     </w:p>
     <w:p/>
@@ -1876,33 +2506,51 @@
     </w:p>
     <w:p/>
     <w:p>
-      <w:r>
-        <w:t>1. 已完成教师模型结构与蒸馏接口理解；</w:t>
-      </w:r>
-    </w:p>
-    <w:p>
-      <w:r>
-        <w:t>2. 已完成输出层蒸馏损失实现与联合训练框架；</w:t>
-      </w:r>
-    </w:p>
-    <w:p>
-      <w:r>
-        <w:t>3. 已完成matched/all蒸馏模式训练链路；</w:t>
-      </w:r>
-    </w:p>
-    <w:p>
-      <w:r>
-        <w:t>4. 已完成light/medium学生配置设计；</w:t>
-      </w:r>
-    </w:p>
-    <w:p>
-      <w:r>
-        <w:t>5. 已完成low_memory重压缩配置的对比与排除分析；</w:t>
-      </w:r>
-    </w:p>
-    <w:p>
-      <w:r>
-        <w:t>6. 已形成参数敏感性实验计划与分阶段验证方案。</w:t>
+      <w:pPr>
+        <w:pStyle w:val="ListNumber"/>
+      </w:pPr>
+      <w:r>
+        <w:t>已完成教师模型结构与蒸馏接口理解；</w:t>
+      </w:r>
+    </w:p>
+    <w:p>
+      <w:pPr>
+        <w:pStyle w:val="ListNumber"/>
+      </w:pPr>
+      <w:r>
+        <w:t>已完成输出层蒸馏损失实现与联合训练框架；</w:t>
+      </w:r>
+    </w:p>
+    <w:p>
+      <w:pPr>
+        <w:pStyle w:val="ListNumber"/>
+      </w:pPr>
+      <w:r>
+        <w:t>已完成matched/all蒸馏模式训练链路；</w:t>
+      </w:r>
+    </w:p>
+    <w:p>
+      <w:pPr>
+        <w:pStyle w:val="ListNumber"/>
+      </w:pPr>
+      <w:r>
+        <w:t>已完成light/medium学生配置设计；</w:t>
+      </w:r>
+    </w:p>
+    <w:p>
+      <w:pPr>
+        <w:pStyle w:val="ListNumber"/>
+      </w:pPr>
+      <w:r>
+        <w:t>已完成low_memory重压缩配置的对比与排除分析；</w:t>
+      </w:r>
+    </w:p>
+    <w:p>
+      <w:pPr>
+        <w:pStyle w:val="ListNumber"/>
+      </w:pPr>
+      <w:r>
+        <w:t>已形成参数敏感性实验计划与分阶段验证方案。</w:t>
       </w:r>
     </w:p>
     <w:p/>

</xml_diff>